<commit_message>
Revert "This reverts commit b1310c143d428733f75ca7f09832f74bb327c103."
This reverts commit 9d4c31db1c1fdfabbb83d4147913fff0643b7b95.
</commit_message>
<xml_diff>
--- a/DAY-1.docx
+++ b/DAY-1.docx
@@ -4,7 +4,18 @@
   <w:body>
     <w:p>
       <w:pPr>
-        <w:spacing w:line="276" w:lineRule="auto"/>
+        <w:spacing w:line="360" w:lineRule="auto"/>
+        <w:rPr>
+          <w:rFonts w:ascii="Times New Roman" w:hAnsi="Times New Roman" w:cs="Times New Roman"/>
+          <w:b/>
+          <w:bCs/>
+          <w:sz w:val="40"/>
+          <w:szCs w:val="40"/>
+          <w:lang w:val="en-US"/>
+        </w:rPr>
+      </w:pPr>
+      <w:proofErr w:type="spellStart"/>
+      <w:r>
         <w:rPr>
           <w:rFonts w:ascii="Times New Roman" w:hAnsi="Times New Roman" w:cs="Times New Roman"/>
           <w:b/>
@@ -13,8 +24,9 @@
           <w:szCs w:val="44"/>
           <w:lang w:val="en-US"/>
         </w:rPr>
-      </w:pPr>
-      <w:proofErr w:type="spellStart"/>
+        <w:t>CompTia</w:t>
+      </w:r>
+      <w:proofErr w:type="spellEnd"/>
       <w:r>
         <w:rPr>
           <w:rFonts w:ascii="Times New Roman" w:hAnsi="Times New Roman" w:cs="Times New Roman"/>
@@ -24,9 +36,8 @@
           <w:szCs w:val="44"/>
           <w:lang w:val="en-US"/>
         </w:rPr>
-        <w:t>CompTia</w:t>
-      </w:r>
-      <w:proofErr w:type="spellEnd"/>
+        <w:t xml:space="preserve"> A+</w:t>
+      </w:r>
       <w:r>
         <w:rPr>
           <w:rFonts w:ascii="Times New Roman" w:hAnsi="Times New Roman" w:cs="Times New Roman"/>
@@ -36,11 +47,100 @@
           <w:szCs w:val="44"/>
           <w:lang w:val="en-US"/>
         </w:rPr>
-        <w:t xml:space="preserve"> A+</w:t>
+        <w:br/>
+      </w:r>
+      <w:r>
+        <w:rPr>
+          <w:rFonts w:ascii="Times New Roman" w:hAnsi="Times New Roman" w:cs="Times New Roman"/>
+          <w:b/>
+          <w:bCs/>
+          <w:sz w:val="36"/>
+          <w:szCs w:val="36"/>
+        </w:rPr>
+        <w:t xml:space="preserve">MODULE: </w:t>
+      </w:r>
+      <w:r>
+        <w:rPr>
+          <w:rFonts w:ascii="Times New Roman" w:hAnsi="Times New Roman" w:cs="Times New Roman"/>
+          <w:b/>
+          <w:bCs/>
+          <w:sz w:val="36"/>
+          <w:szCs w:val="36"/>
+        </w:rPr>
+        <w:t>Hardware and Components Basics</w:t>
+      </w:r>
+      <w:r>
+        <w:rPr>
+          <w:rFonts w:ascii="Times New Roman" w:hAnsi="Times New Roman" w:cs="Times New Roman"/>
+          <w:b/>
+          <w:bCs/>
+          <w:sz w:val="36"/>
+          <w:szCs w:val="36"/>
+        </w:rPr>
+        <w:t>:</w:t>
+      </w:r>
+      <w:r>
+        <w:rPr>
+          <w:rFonts w:ascii="Times New Roman" w:hAnsi="Times New Roman" w:cs="Times New Roman"/>
+          <w:b/>
+          <w:bCs/>
+          <w:sz w:val="36"/>
+          <w:szCs w:val="36"/>
+        </w:rPr>
+        <w:t xml:space="preserve"> Understanding of Hardware and its components</w:t>
+      </w:r>
+      <w:r>
+        <w:rPr>
+          <w:rFonts w:ascii="Times New Roman" w:hAnsi="Times New Roman" w:cs="Times New Roman"/>
+          <w:b/>
+          <w:bCs/>
+          <w:sz w:val="44"/>
+          <w:szCs w:val="44"/>
+          <w:lang w:val="en-US"/>
+        </w:rPr>
+        <w:br/>
+      </w:r>
+      <w:r>
+        <w:rPr>
+          <w:rFonts w:ascii="Times New Roman" w:hAnsi="Times New Roman" w:cs="Times New Roman"/>
+          <w:b/>
+          <w:bCs/>
+          <w:sz w:val="40"/>
+          <w:szCs w:val="40"/>
+        </w:rPr>
+        <w:t>Day 1: Overview of Hardware Components</w:t>
+      </w:r>
+      <w:r>
+        <w:rPr>
+          <w:rFonts w:ascii="Times New Roman" w:hAnsi="Times New Roman" w:cs="Times New Roman"/>
+          <w:b/>
+          <w:bCs/>
+          <w:sz w:val="40"/>
+          <w:szCs w:val="40"/>
+        </w:rPr>
+        <w:t xml:space="preserve"> </w:t>
+      </w:r>
+      <w:r>
+        <w:rPr>
+          <w:rFonts w:ascii="Times New Roman" w:hAnsi="Times New Roman" w:cs="Times New Roman"/>
+          <w:b/>
+          <w:bCs/>
+          <w:sz w:val="40"/>
+          <w:szCs w:val="40"/>
+        </w:rPr>
+        <w:t>Theory </w:t>
       </w:r>
     </w:p>
     <w:p>
       <w:pPr>
+        <w:spacing w:line="360" w:lineRule="auto"/>
+        <w:rPr>
+          <w:rFonts w:ascii="Times New Roman" w:hAnsi="Times New Roman" w:cs="Times New Roman"/>
+          <w:sz w:val="28"/>
+          <w:szCs w:val="28"/>
+        </w:rPr>
+      </w:pPr>
+      <w:r>
         <w:rPr>
           <w:rFonts w:ascii="Times New Roman" w:hAnsi="Times New Roman" w:cs="Times New Roman"/>
           <w:b/>
@@ -49,7 +149,8 @@
           <w:szCs w:val="36"/>
           <w:lang w:val="en-US"/>
         </w:rPr>
-      </w:pPr>
+        <w:t>TASKS</w:t>
+      </w:r>
       <w:r>
         <w:rPr>
           <w:rFonts w:ascii="Times New Roman" w:hAnsi="Times New Roman" w:cs="Times New Roman"/>
@@ -59,17 +160,59 @@
           <w:szCs w:val="36"/>
           <w:lang w:val="en-US"/>
         </w:rPr>
-        <w:t>1)</w:t>
-      </w:r>
-      <w:r>
-        <w:rPr>
-          <w:rFonts w:ascii="Times New Roman" w:hAnsi="Times New Roman" w:cs="Times New Roman"/>
-          <w:b/>
-          <w:bCs/>
-          <w:sz w:val="36"/>
-          <w:szCs w:val="36"/>
-        </w:rPr>
-        <w:t>Hardware and Components Basics Understanding of Hardware and its components</w:t>
+        <w:br/>
+      </w:r>
+      <w:r>
+        <w:rPr>
+          <w:rFonts w:ascii="Times New Roman" w:hAnsi="Times New Roman" w:cs="Times New Roman"/>
+          <w:b/>
+          <w:bCs/>
+          <w:sz w:val="28"/>
+          <w:szCs w:val="28"/>
+        </w:rPr>
+        <w:t>1.</w:t>
+      </w:r>
+      <w:r>
+        <w:rPr>
+          <w:rFonts w:ascii="Times New Roman" w:hAnsi="Times New Roman" w:cs="Times New Roman"/>
+          <w:sz w:val="28"/>
+          <w:szCs w:val="28"/>
+        </w:rPr>
+        <w:t xml:space="preserve"> </w:t>
+      </w:r>
+      <w:r>
+        <w:rPr>
+          <w:rFonts w:ascii="Times New Roman" w:hAnsi="Times New Roman" w:cs="Times New Roman"/>
+          <w:sz w:val="28"/>
+          <w:szCs w:val="28"/>
+        </w:rPr>
+        <w:t>Draw a labe</w:t>
+      </w:r>
+      <w:r>
+        <w:rPr>
+          <w:rFonts w:ascii="Times New Roman" w:hAnsi="Times New Roman" w:cs="Times New Roman"/>
+          <w:sz w:val="28"/>
+          <w:szCs w:val="28"/>
+        </w:rPr>
+        <w:t>l</w:t>
+      </w:r>
+      <w:r>
+        <w:rPr>
+          <w:rFonts w:ascii="Times New Roman" w:hAnsi="Times New Roman" w:cs="Times New Roman"/>
+          <w:sz w:val="28"/>
+          <w:szCs w:val="28"/>
+        </w:rPr>
+        <w:t>led diagram of a desktop PC, clearly marking the motherboard, CPU, RAM, GPU, and both HDD and SSD storage components</w:t>
+      </w:r>
+      <w:r>
+        <w:rPr>
+          <w:rFonts w:ascii="Times New Roman" w:hAnsi="Times New Roman" w:cs="Times New Roman"/>
+          <w:b/>
+          <w:bCs/>
+          <w:sz w:val="28"/>
+          <w:szCs w:val="28"/>
+        </w:rPr>
+        <w:t>.</w:t>
       </w:r>
     </w:p>
     <w:p>
@@ -78,160 +221,6 @@
         <w:jc w:val="both"/>
         <w:rPr>
           <w:rFonts w:ascii="Times New Roman" w:hAnsi="Times New Roman" w:cs="Times New Roman"/>
-          <w:b/>
-          <w:bCs/>
-          <w:sz w:val="28"/>
-          <w:szCs w:val="28"/>
-        </w:rPr>
-      </w:pPr>
-      <w:r>
-        <w:rPr>
-          <w:rFonts w:ascii="Times New Roman" w:hAnsi="Times New Roman" w:cs="Times New Roman"/>
-          <w:b/>
-          <w:bCs/>
-          <w:sz w:val="36"/>
-          <w:szCs w:val="36"/>
-          <w:lang w:val="en-US"/>
-        </w:rPr>
-        <w:t>Assignment-1</w:t>
-      </w:r>
-      <w:r>
-        <w:rPr>
-          <w:rFonts w:ascii="Times New Roman" w:hAnsi="Times New Roman" w:cs="Times New Roman"/>
-          <w:b/>
-          <w:bCs/>
-          <w:sz w:val="36"/>
-          <w:szCs w:val="36"/>
-          <w:lang w:val="en-US"/>
-        </w:rPr>
-        <w:br/>
-      </w:r>
-      <w:r>
-        <w:rPr>
-          <w:rFonts w:ascii="Times New Roman" w:hAnsi="Times New Roman" w:cs="Times New Roman"/>
-          <w:sz w:val="28"/>
-          <w:szCs w:val="28"/>
-        </w:rPr>
-        <w:t>Day 1: Overview of Hardware Components</w:t>
-      </w:r>
-      <w:r>
-        <w:rPr>
-          <w:rFonts w:ascii="Times New Roman" w:hAnsi="Times New Roman" w:cs="Times New Roman"/>
-          <w:sz w:val="28"/>
-          <w:szCs w:val="28"/>
-        </w:rPr>
-        <w:t xml:space="preserve"> </w:t>
-      </w:r>
-      <w:r>
-        <w:rPr>
-          <w:rFonts w:ascii="Times New Roman" w:hAnsi="Times New Roman" w:cs="Times New Roman"/>
-          <w:sz w:val="28"/>
-          <w:szCs w:val="28"/>
-        </w:rPr>
-        <w:t>Theory (1 hour):</w:t>
-      </w:r>
-      <w:r>
-        <w:rPr>
-          <w:rFonts w:ascii="Times New Roman" w:hAnsi="Times New Roman" w:cs="Times New Roman"/>
-          <w:sz w:val="28"/>
-          <w:szCs w:val="28"/>
-        </w:rPr>
-        <w:t xml:space="preserve"> </w:t>
-      </w:r>
-      <w:r>
-        <w:rPr>
-          <w:rFonts w:ascii="Times New Roman" w:hAnsi="Times New Roman" w:cs="Times New Roman"/>
-          <w:sz w:val="28"/>
-          <w:szCs w:val="28"/>
-        </w:rPr>
-        <w:t>Introduction to motherboards, CPUs, RAM, GPUs, storage (HDD, SSD).</w:t>
-      </w:r>
-      <w:r>
-        <w:rPr>
-          <w:rFonts w:ascii="Times New Roman" w:hAnsi="Times New Roman" w:cs="Times New Roman"/>
-          <w:sz w:val="28"/>
-          <w:szCs w:val="28"/>
-        </w:rPr>
-        <w:t xml:space="preserve"> </w:t>
-      </w:r>
-      <w:r>
-        <w:rPr>
-          <w:rFonts w:ascii="Times New Roman" w:hAnsi="Times New Roman" w:cs="Times New Roman"/>
-          <w:sz w:val="28"/>
-          <w:szCs w:val="28"/>
-        </w:rPr>
-        <w:t>Importance of each component in a computer system.</w:t>
-      </w:r>
-      <w:r>
-        <w:rPr>
-          <w:rFonts w:ascii="Times New Roman" w:hAnsi="Times New Roman" w:cs="Times New Roman"/>
-          <w:sz w:val="28"/>
-          <w:szCs w:val="28"/>
-        </w:rPr>
-        <w:t xml:space="preserve"> </w:t>
-      </w:r>
-      <w:r>
-        <w:rPr>
-          <w:rFonts w:ascii="Times New Roman" w:hAnsi="Times New Roman" w:cs="Times New Roman"/>
-          <w:sz w:val="28"/>
-          <w:szCs w:val="28"/>
-        </w:rPr>
-        <w:t>Assignment: Create a diagram of a</w:t>
-      </w:r>
-      <w:r>
-        <w:rPr>
-          <w:rFonts w:ascii="Times New Roman" w:hAnsi="Times New Roman" w:cs="Times New Roman"/>
-          <w:sz w:val="28"/>
-          <w:szCs w:val="28"/>
-        </w:rPr>
-        <w:t xml:space="preserve"> PC with labelled hardware compon</w:t>
-      </w:r>
-      <w:r>
-        <w:rPr>
-          <w:rFonts w:ascii="Times New Roman" w:hAnsi="Times New Roman" w:cs="Times New Roman"/>
-          <w:sz w:val="28"/>
-          <w:szCs w:val="28"/>
-        </w:rPr>
-        <w:t>e</w:t>
-      </w:r>
-      <w:r>
-        <w:rPr>
-          <w:rFonts w:ascii="Times New Roman" w:hAnsi="Times New Roman" w:cs="Times New Roman"/>
-          <w:sz w:val="28"/>
-          <w:szCs w:val="28"/>
-        </w:rPr>
-        <w:t>nts</w:t>
-      </w:r>
-      <w:r>
-        <w:rPr>
-          <w:rFonts w:ascii="Times New Roman" w:hAnsi="Times New Roman" w:cs="Times New Roman"/>
-          <w:b/>
-          <w:bCs/>
-          <w:sz w:val="28"/>
-          <w:szCs w:val="28"/>
-        </w:rPr>
-        <w:t>.</w:t>
-      </w:r>
-    </w:p>
-    <w:p>
-      <w:pPr>
-        <w:spacing w:line="276" w:lineRule="auto"/>
-        <w:jc w:val="both"/>
-        <w:rPr>
-          <w:rFonts w:ascii="Times New Roman" w:hAnsi="Times New Roman" w:cs="Times New Roman"/>
-          <w:b/>
-          <w:bCs/>
-          <w:sz w:val="28"/>
-          <w:szCs w:val="28"/>
-        </w:rPr>
-      </w:pPr>
-    </w:p>
-    <w:p>
-      <w:pPr>
-        <w:spacing w:line="276" w:lineRule="auto"/>
-        <w:jc w:val="both"/>
-        <w:rPr>
-          <w:rFonts w:ascii="Times New Roman" w:hAnsi="Times New Roman" w:cs="Times New Roman"/>
           <w:sz w:val="44"/>
           <w:szCs w:val="44"/>
           <w:lang w:val="en-US"/>
@@ -246,7 +235,7 @@
           <w:lang w:val="en-US"/>
         </w:rPr>
         <w:drawing>
-          <wp:inline distT="0" distB="0" distL="0" distR="0" wp14:anchorId="3D559CDB" wp14:editId="03F38372">
+          <wp:inline distT="0" distB="0" distL="0" distR="0" wp14:anchorId="3276A109" wp14:editId="26540339">
             <wp:extent cx="5731510" cy="3924300"/>
             <wp:effectExtent l="0" t="0" r="2540" b="0"/>
             <wp:docPr id="137353328" name="Picture 1"/>
@@ -261,7 +250,7 @@
                     <pic:cNvPicPr/>
                   </pic:nvPicPr>
                   <pic:blipFill>
-                    <a:blip r:embed="rId4">
+                    <a:blip r:embed="rId6">
                       <a:extLst>
                         <a:ext uri="{28A0092B-C50C-407E-A947-70E740481C1C}">
                           <a14:useLocalDpi xmlns:a14="http://schemas.microsoft.com/office/drawing/2010/main" val="0"/>
@@ -288,6 +277,1604 @@
         </w:drawing>
       </w:r>
     </w:p>
+    <w:p>
+      <w:pPr>
+        <w:spacing w:line="276" w:lineRule="auto"/>
+        <w:jc w:val="both"/>
+        <w:rPr>
+          <w:rFonts w:ascii="Times New Roman" w:hAnsi="Times New Roman" w:cs="Times New Roman"/>
+          <w:sz w:val="44"/>
+          <w:szCs w:val="44"/>
+        </w:rPr>
+      </w:pPr>
+      <w:r>
+        <w:rPr>
+          <w:rFonts w:ascii="Times New Roman" w:hAnsi="Times New Roman" w:cs="Times New Roman"/>
+          <w:sz w:val="44"/>
+          <w:szCs w:val="44"/>
+          <w:lang w:val="en-US"/>
+        </w:rPr>
+        <w:br/>
+      </w:r>
+      <w:r>
+        <w:rPr>
+          <w:rFonts w:ascii="Times New Roman" w:hAnsi="Times New Roman" w:cs="Times New Roman"/>
+          <w:sz w:val="44"/>
+          <w:szCs w:val="44"/>
+          <w:lang w:val="en-US"/>
+        </w:rPr>
+        <w:br/>
+      </w:r>
+      <w:r>
+        <w:rPr>
+          <w:rFonts w:ascii="Times New Roman" w:hAnsi="Times New Roman" w:cs="Times New Roman"/>
+          <w:sz w:val="44"/>
+          <w:szCs w:val="44"/>
+          <w:lang w:val="en-US"/>
+        </w:rPr>
+        <w:br/>
+      </w:r>
+      <w:r>
+        <w:rPr>
+          <w:rFonts w:ascii="Times New Roman" w:hAnsi="Times New Roman" w:cs="Times New Roman"/>
+          <w:sz w:val="44"/>
+          <w:szCs w:val="44"/>
+          <w:lang w:val="en-US"/>
+        </w:rPr>
+        <w:br/>
+      </w:r>
+    </w:p>
+    <w:p>
+      <w:pPr>
+        <w:spacing w:line="276" w:lineRule="auto"/>
+        <w:rPr>
+          <w:rFonts w:ascii="Times New Roman" w:hAnsi="Times New Roman" w:cs="Times New Roman"/>
+          <w:sz w:val="28"/>
+          <w:szCs w:val="28"/>
+        </w:rPr>
+      </w:pPr>
+      <w:r>
+        <w:rPr>
+          <w:rFonts w:ascii="Times New Roman" w:hAnsi="Times New Roman" w:cs="Times New Roman"/>
+          <w:b/>
+          <w:bCs/>
+          <w:sz w:val="28"/>
+          <w:szCs w:val="28"/>
+        </w:rPr>
+        <w:lastRenderedPageBreak/>
+        <w:t>2.</w:t>
+      </w:r>
+      <w:r>
+        <w:rPr>
+          <w:rFonts w:ascii="Times New Roman" w:hAnsi="Times New Roman" w:cs="Times New Roman"/>
+          <w:sz w:val="28"/>
+          <w:szCs w:val="28"/>
+        </w:rPr>
+        <w:t>Create a comparison table showing the main differences between HDD and SSD storage in terms of speed, durability, and typical use cases.</w:t>
+      </w:r>
+      <w:r>
+        <w:rPr>
+          <w:rFonts w:ascii="Times New Roman" w:hAnsi="Times New Roman" w:cs="Times New Roman"/>
+          <w:sz w:val="28"/>
+          <w:szCs w:val="28"/>
+        </w:rPr>
+        <w:t xml:space="preserve"> </w:t>
+      </w:r>
+      <w:r>
+        <w:rPr>
+          <w:rFonts w:ascii="Times New Roman" w:hAnsi="Times New Roman" w:cs="Times New Roman"/>
+          <w:sz w:val="28"/>
+          <w:szCs w:val="28"/>
+        </w:rPr>
+        <w:t>&lt;</w:t>
+      </w:r>
+      <w:proofErr w:type="spellStart"/>
+      <w:r>
+        <w:rPr>
+          <w:rFonts w:ascii="Times New Roman" w:hAnsi="Times New Roman" w:cs="Times New Roman"/>
+          <w:sz w:val="28"/>
+          <w:szCs w:val="28"/>
+        </w:rPr>
+        <w:t>br</w:t>
+      </w:r>
+      <w:proofErr w:type="spellEnd"/>
+      <w:r>
+        <w:rPr>
+          <w:rFonts w:ascii="Times New Roman" w:hAnsi="Times New Roman" w:cs="Times New Roman"/>
+          <w:sz w:val="28"/>
+          <w:szCs w:val="28"/>
+        </w:rPr>
+        <w:t>&gt;</w:t>
+      </w:r>
+      <w:r>
+        <w:rPr>
+          <w:rFonts w:ascii="Times New Roman" w:hAnsi="Times New Roman" w:cs="Times New Roman"/>
+          <w:sz w:val="28"/>
+          <w:szCs w:val="28"/>
+        </w:rPr>
+        <w:t xml:space="preserve"> </w:t>
+      </w:r>
+      <w:r>
+        <w:rPr>
+          <w:rFonts w:ascii="Times New Roman" w:hAnsi="Times New Roman" w:cs="Times New Roman"/>
+          <w:sz w:val="28"/>
+          <w:szCs w:val="28"/>
+        </w:rPr>
+        <w:t>&lt;</w:t>
+      </w:r>
+      <w:proofErr w:type="spellStart"/>
+      <w:r>
+        <w:rPr>
+          <w:rFonts w:ascii="Times New Roman" w:hAnsi="Times New Roman" w:cs="Times New Roman"/>
+          <w:sz w:val="28"/>
+          <w:szCs w:val="28"/>
+        </w:rPr>
+        <w:t>br</w:t>
+      </w:r>
+      <w:proofErr w:type="spellEnd"/>
+      <w:r>
+        <w:rPr>
+          <w:rFonts w:ascii="Times New Roman" w:hAnsi="Times New Roman" w:cs="Times New Roman"/>
+          <w:sz w:val="28"/>
+          <w:szCs w:val="28"/>
+        </w:rPr>
+        <w:t>&gt;</w:t>
+      </w:r>
+      <w:r>
+        <w:rPr>
+          <w:rFonts w:ascii="Times New Roman" w:hAnsi="Times New Roman" w:cs="Times New Roman"/>
+          <w:sz w:val="28"/>
+          <w:szCs w:val="28"/>
+        </w:rPr>
+        <w:t xml:space="preserve"> </w:t>
+      </w:r>
+      <w:r>
+        <w:rPr>
+          <w:rFonts w:ascii="Times New Roman" w:hAnsi="Times New Roman" w:cs="Times New Roman"/>
+          <w:sz w:val="28"/>
+          <w:szCs w:val="28"/>
+        </w:rPr>
+        <w:t>&lt;</w:t>
+      </w:r>
+      <w:proofErr w:type="spellStart"/>
+      <w:r>
+        <w:rPr>
+          <w:rFonts w:ascii="Times New Roman" w:hAnsi="Times New Roman" w:cs="Times New Roman"/>
+          <w:sz w:val="28"/>
+          <w:szCs w:val="28"/>
+        </w:rPr>
+        <w:t>em</w:t>
+      </w:r>
+      <w:proofErr w:type="spellEnd"/>
+      <w:r>
+        <w:rPr>
+          <w:rFonts w:ascii="Times New Roman" w:hAnsi="Times New Roman" w:cs="Times New Roman"/>
+          <w:sz w:val="28"/>
+          <w:szCs w:val="28"/>
+        </w:rPr>
+        <w:t>&gt;&lt;strong&gt;Hint:&lt;/strong&gt; Think about which one is faster, which is more shock-resistant, and where you would usually find each type (laptop, gaming PC, etc.</w:t>
+      </w:r>
+      <w:proofErr w:type="gramStart"/>
+      <w:r>
+        <w:rPr>
+          <w:rFonts w:ascii="Times New Roman" w:hAnsi="Times New Roman" w:cs="Times New Roman"/>
+          <w:sz w:val="28"/>
+          <w:szCs w:val="28"/>
+        </w:rPr>
+        <w:t>).&lt;</w:t>
+      </w:r>
+      <w:proofErr w:type="gramEnd"/>
+      <w:r>
+        <w:rPr>
+          <w:rFonts w:ascii="Times New Roman" w:hAnsi="Times New Roman" w:cs="Times New Roman"/>
+          <w:sz w:val="28"/>
+          <w:szCs w:val="28"/>
+        </w:rPr>
+        <w:t>/</w:t>
+      </w:r>
+      <w:proofErr w:type="spellStart"/>
+      <w:r>
+        <w:rPr>
+          <w:rFonts w:ascii="Times New Roman" w:hAnsi="Times New Roman" w:cs="Times New Roman"/>
+          <w:sz w:val="28"/>
+          <w:szCs w:val="28"/>
+        </w:rPr>
+        <w:t>em</w:t>
+      </w:r>
+      <w:proofErr w:type="spellEnd"/>
+      <w:r>
+        <w:rPr>
+          <w:rFonts w:ascii="Times New Roman" w:hAnsi="Times New Roman" w:cs="Times New Roman"/>
+          <w:sz w:val="28"/>
+          <w:szCs w:val="28"/>
+        </w:rPr>
+        <w:t>&gt;</w:t>
+      </w:r>
+      <w:r>
+        <w:rPr>
+          <w:rFonts w:ascii="Times New Roman" w:hAnsi="Times New Roman" w:cs="Times New Roman"/>
+          <w:b/>
+          <w:bCs/>
+          <w:sz w:val="28"/>
+          <w:szCs w:val="28"/>
+        </w:rPr>
+        <w:t>.</w:t>
+      </w:r>
+      <w:r>
+        <w:rPr>
+          <w:rFonts w:ascii="Times New Roman" w:hAnsi="Times New Roman" w:cs="Times New Roman"/>
+          <w:b/>
+          <w:bCs/>
+          <w:sz w:val="28"/>
+          <w:szCs w:val="28"/>
+        </w:rPr>
+        <w:t xml:space="preserve"> </w:t>
+      </w:r>
+      <w:r>
+        <w:rPr>
+          <w:rFonts w:ascii="Times New Roman" w:hAnsi="Times New Roman" w:cs="Times New Roman"/>
+          <w:b/>
+          <w:bCs/>
+          <w:sz w:val="28"/>
+          <w:szCs w:val="28"/>
+        </w:rPr>
+        <w:br/>
+      </w:r>
+    </w:p>
+    <w:tbl>
+      <w:tblPr>
+        <w:tblStyle w:val="TableGrid"/>
+        <w:tblW w:w="9102" w:type="dxa"/>
+        <w:tblLook w:val="04A0" w:firstRow="1" w:lastRow="0" w:firstColumn="1" w:lastColumn="0" w:noHBand="0" w:noVBand="1"/>
+      </w:tblPr>
+      <w:tblGrid>
+        <w:gridCol w:w="2284"/>
+        <w:gridCol w:w="3578"/>
+        <w:gridCol w:w="3240"/>
+      </w:tblGrid>
+      <w:tr>
+        <w:trPr>
+          <w:trHeight w:val="529"/>
+        </w:trPr>
+        <w:tc>
+          <w:tcPr>
+            <w:tcW w:w="2284" w:type="dxa"/>
+          </w:tcPr>
+          <w:p>
+            <w:pPr>
+              <w:jc w:val="both"/>
+              <w:rPr>
+                <w:rFonts w:ascii="Times New Roman" w:hAnsi="Times New Roman" w:cs="Times New Roman"/>
+                <w:b/>
+                <w:bCs/>
+                <w:sz w:val="28"/>
+                <w:szCs w:val="28"/>
+              </w:rPr>
+            </w:pPr>
+            <w:r>
+              <w:rPr>
+                <w:rFonts w:ascii="Times New Roman" w:hAnsi="Times New Roman" w:cs="Times New Roman"/>
+                <w:b/>
+                <w:bCs/>
+                <w:sz w:val="28"/>
+                <w:szCs w:val="28"/>
+              </w:rPr>
+              <w:t>Feature</w:t>
+            </w:r>
+          </w:p>
+        </w:tc>
+        <w:tc>
+          <w:tcPr>
+            <w:tcW w:w="3578" w:type="dxa"/>
+          </w:tcPr>
+          <w:p>
+            <w:pPr>
+              <w:spacing w:line="276" w:lineRule="auto"/>
+              <w:jc w:val="both"/>
+              <w:rPr>
+                <w:rFonts w:ascii="Times New Roman" w:hAnsi="Times New Roman" w:cs="Times New Roman"/>
+                <w:b/>
+                <w:bCs/>
+                <w:sz w:val="28"/>
+                <w:szCs w:val="28"/>
+                <w:lang w:val="en-US"/>
+              </w:rPr>
+            </w:pPr>
+            <w:r>
+              <w:rPr>
+                <w:rFonts w:ascii="Times New Roman" w:hAnsi="Times New Roman" w:cs="Times New Roman"/>
+                <w:b/>
+                <w:bCs/>
+                <w:sz w:val="28"/>
+                <w:szCs w:val="28"/>
+              </w:rPr>
+              <w:t>HDD (Hard Disk Drive)</w:t>
+            </w:r>
+          </w:p>
+        </w:tc>
+        <w:tc>
+          <w:tcPr>
+            <w:tcW w:w="3240" w:type="dxa"/>
+          </w:tcPr>
+          <w:p>
+            <w:pPr>
+              <w:spacing w:line="276" w:lineRule="auto"/>
+              <w:jc w:val="both"/>
+              <w:rPr>
+                <w:rFonts w:ascii="Times New Roman" w:hAnsi="Times New Roman" w:cs="Times New Roman"/>
+                <w:b/>
+                <w:bCs/>
+                <w:sz w:val="28"/>
+                <w:szCs w:val="28"/>
+                <w:lang w:val="en-US"/>
+              </w:rPr>
+            </w:pPr>
+            <w:r>
+              <w:rPr>
+                <w:rFonts w:ascii="Times New Roman" w:hAnsi="Times New Roman" w:cs="Times New Roman"/>
+                <w:b/>
+                <w:bCs/>
+                <w:sz w:val="28"/>
+                <w:szCs w:val="28"/>
+              </w:rPr>
+              <w:t>SSD (Solid State Drive)</w:t>
+            </w:r>
+          </w:p>
+        </w:tc>
+      </w:tr>
+      <w:tr>
+        <w:trPr>
+          <w:trHeight w:val="566"/>
+        </w:trPr>
+        <w:tc>
+          <w:tcPr>
+            <w:tcW w:w="2284" w:type="dxa"/>
+          </w:tcPr>
+          <w:p>
+            <w:pPr>
+              <w:spacing w:line="276" w:lineRule="auto"/>
+              <w:jc w:val="both"/>
+              <w:rPr>
+                <w:rFonts w:ascii="Times New Roman" w:hAnsi="Times New Roman" w:cs="Times New Roman"/>
+                <w:sz w:val="28"/>
+                <w:szCs w:val="28"/>
+                <w:lang w:val="en-US"/>
+              </w:rPr>
+            </w:pPr>
+            <w:r>
+              <w:rPr>
+                <w:rFonts w:ascii="Times New Roman" w:hAnsi="Times New Roman" w:cs="Times New Roman"/>
+                <w:sz w:val="28"/>
+                <w:szCs w:val="28"/>
+                <w:lang w:val="en-US"/>
+              </w:rPr>
+              <w:t>Speed</w:t>
+            </w:r>
+          </w:p>
+        </w:tc>
+        <w:tc>
+          <w:tcPr>
+            <w:tcW w:w="3578" w:type="dxa"/>
+          </w:tcPr>
+          <w:p>
+            <w:pPr>
+              <w:spacing w:line="276" w:lineRule="auto"/>
+              <w:jc w:val="both"/>
+              <w:rPr>
+                <w:rFonts w:ascii="Times New Roman" w:hAnsi="Times New Roman" w:cs="Times New Roman"/>
+                <w:vanish/>
+                <w:sz w:val="28"/>
+                <w:szCs w:val="28"/>
+              </w:rPr>
+            </w:pPr>
+          </w:p>
+          <w:p>
+            <w:pPr>
+              <w:spacing w:line="276" w:lineRule="auto"/>
+              <w:jc w:val="both"/>
+              <w:rPr>
+                <w:rFonts w:ascii="Times New Roman" w:hAnsi="Times New Roman" w:cs="Times New Roman"/>
+                <w:sz w:val="28"/>
+                <w:szCs w:val="28"/>
+                <w:lang w:val="en-US"/>
+              </w:rPr>
+            </w:pPr>
+            <w:r>
+              <w:rPr>
+                <w:rFonts w:ascii="Times New Roman" w:hAnsi="Times New Roman" w:cs="Times New Roman"/>
+                <w:sz w:val="28"/>
+                <w:szCs w:val="28"/>
+                <w:lang w:val="en-US"/>
+              </w:rPr>
+              <w:t>Slower</w:t>
+            </w:r>
+          </w:p>
+        </w:tc>
+        <w:tc>
+          <w:tcPr>
+            <w:tcW w:w="3240" w:type="dxa"/>
+          </w:tcPr>
+          <w:p>
+            <w:pPr>
+              <w:spacing w:line="276" w:lineRule="auto"/>
+              <w:jc w:val="both"/>
+              <w:rPr>
+                <w:rFonts w:ascii="Times New Roman" w:hAnsi="Times New Roman" w:cs="Times New Roman"/>
+                <w:sz w:val="28"/>
+                <w:szCs w:val="28"/>
+                <w:lang w:val="en-US"/>
+              </w:rPr>
+            </w:pPr>
+            <w:r>
+              <w:rPr>
+                <w:rFonts w:ascii="Times New Roman" w:hAnsi="Times New Roman" w:cs="Times New Roman"/>
+                <w:sz w:val="28"/>
+                <w:szCs w:val="28"/>
+                <w:lang w:val="en-US"/>
+              </w:rPr>
+              <w:t>Much faster</w:t>
+            </w:r>
+          </w:p>
+        </w:tc>
+      </w:tr>
+      <w:tr>
+        <w:trPr>
+          <w:trHeight w:val="842"/>
+        </w:trPr>
+        <w:tc>
+          <w:tcPr>
+            <w:tcW w:w="2284" w:type="dxa"/>
+          </w:tcPr>
+          <w:p>
+            <w:pPr>
+              <w:spacing w:line="276" w:lineRule="auto"/>
+              <w:jc w:val="both"/>
+              <w:rPr>
+                <w:rFonts w:ascii="Times New Roman" w:hAnsi="Times New Roman" w:cs="Times New Roman"/>
+                <w:sz w:val="28"/>
+                <w:szCs w:val="28"/>
+                <w:lang w:val="en-US"/>
+              </w:rPr>
+            </w:pPr>
+            <w:r>
+              <w:rPr>
+                <w:rFonts w:ascii="Times New Roman" w:hAnsi="Times New Roman" w:cs="Times New Roman"/>
+                <w:sz w:val="28"/>
+                <w:szCs w:val="28"/>
+                <w:lang w:val="en-US"/>
+              </w:rPr>
+              <w:t>Durability</w:t>
+            </w:r>
+          </w:p>
+        </w:tc>
+        <w:tc>
+          <w:tcPr>
+            <w:tcW w:w="3578" w:type="dxa"/>
+          </w:tcPr>
+          <w:p>
+            <w:pPr>
+              <w:spacing w:line="276" w:lineRule="auto"/>
+              <w:jc w:val="both"/>
+              <w:rPr>
+                <w:rFonts w:ascii="Times New Roman" w:hAnsi="Times New Roman" w:cs="Times New Roman"/>
+                <w:sz w:val="28"/>
+                <w:szCs w:val="28"/>
+                <w:lang w:val="en-US"/>
+              </w:rPr>
+            </w:pPr>
+            <w:r>
+              <w:rPr>
+                <w:rFonts w:ascii="Times New Roman" w:hAnsi="Times New Roman" w:cs="Times New Roman"/>
+                <w:sz w:val="28"/>
+                <w:szCs w:val="28"/>
+              </w:rPr>
+              <w:t>Less durable; has moving parts</w:t>
+            </w:r>
+          </w:p>
+        </w:tc>
+        <w:tc>
+          <w:tcPr>
+            <w:tcW w:w="3240" w:type="dxa"/>
+          </w:tcPr>
+          <w:p>
+            <w:pPr>
+              <w:spacing w:line="276" w:lineRule="auto"/>
+              <w:jc w:val="both"/>
+              <w:rPr>
+                <w:rFonts w:ascii="Times New Roman" w:hAnsi="Times New Roman" w:cs="Times New Roman"/>
+                <w:sz w:val="28"/>
+                <w:szCs w:val="28"/>
+                <w:lang w:val="en-US"/>
+              </w:rPr>
+            </w:pPr>
+            <w:r>
+              <w:rPr>
+                <w:rFonts w:ascii="Times New Roman" w:hAnsi="Times New Roman" w:cs="Times New Roman"/>
+                <w:sz w:val="28"/>
+                <w:szCs w:val="28"/>
+              </w:rPr>
+              <w:t>More durable; no moving parts</w:t>
+            </w:r>
+          </w:p>
+        </w:tc>
+      </w:tr>
+      <w:tr>
+        <w:trPr>
+          <w:trHeight w:val="796"/>
+        </w:trPr>
+        <w:tc>
+          <w:tcPr>
+            <w:tcW w:w="2284" w:type="dxa"/>
+          </w:tcPr>
+          <w:p>
+            <w:pPr>
+              <w:spacing w:line="276" w:lineRule="auto"/>
+              <w:jc w:val="both"/>
+              <w:rPr>
+                <w:rFonts w:ascii="Times New Roman" w:hAnsi="Times New Roman" w:cs="Times New Roman"/>
+                <w:sz w:val="28"/>
+                <w:szCs w:val="28"/>
+                <w:lang w:val="en-US"/>
+              </w:rPr>
+            </w:pPr>
+            <w:r>
+              <w:rPr>
+                <w:rFonts w:ascii="Times New Roman" w:hAnsi="Times New Roman" w:cs="Times New Roman"/>
+                <w:sz w:val="28"/>
+                <w:szCs w:val="28"/>
+                <w:lang w:val="en-US"/>
+              </w:rPr>
+              <w:t>Shock Resistance</w:t>
+            </w:r>
+          </w:p>
+        </w:tc>
+        <w:tc>
+          <w:tcPr>
+            <w:tcW w:w="3578" w:type="dxa"/>
+          </w:tcPr>
+          <w:p>
+            <w:pPr>
+              <w:spacing w:line="276" w:lineRule="auto"/>
+              <w:jc w:val="both"/>
+              <w:rPr>
+                <w:rFonts w:ascii="Times New Roman" w:hAnsi="Times New Roman" w:cs="Times New Roman"/>
+                <w:sz w:val="28"/>
+                <w:szCs w:val="28"/>
+                <w:lang w:val="en-US"/>
+              </w:rPr>
+            </w:pPr>
+            <w:r>
+              <w:rPr>
+                <w:rFonts w:ascii="Times New Roman" w:hAnsi="Times New Roman" w:cs="Times New Roman"/>
+                <w:sz w:val="28"/>
+                <w:szCs w:val="28"/>
+              </w:rPr>
+              <w:t>More sensitive to shocks and drops</w:t>
+            </w:r>
+          </w:p>
+        </w:tc>
+        <w:tc>
+          <w:tcPr>
+            <w:tcW w:w="3240" w:type="dxa"/>
+          </w:tcPr>
+          <w:p>
+            <w:pPr>
+              <w:spacing w:line="276" w:lineRule="auto"/>
+              <w:jc w:val="both"/>
+              <w:rPr>
+                <w:rFonts w:ascii="Times New Roman" w:hAnsi="Times New Roman" w:cs="Times New Roman"/>
+                <w:sz w:val="28"/>
+                <w:szCs w:val="28"/>
+                <w:lang w:val="en-US"/>
+              </w:rPr>
+            </w:pPr>
+            <w:r>
+              <w:rPr>
+                <w:rFonts w:ascii="Times New Roman" w:hAnsi="Times New Roman" w:cs="Times New Roman"/>
+                <w:sz w:val="28"/>
+                <w:szCs w:val="28"/>
+              </w:rPr>
+              <w:t>More resistant to shocks and vibrations</w:t>
+            </w:r>
+          </w:p>
+        </w:tc>
+      </w:tr>
+      <w:tr>
+        <w:trPr>
+          <w:trHeight w:val="750"/>
+        </w:trPr>
+        <w:tc>
+          <w:tcPr>
+            <w:tcW w:w="2284" w:type="dxa"/>
+          </w:tcPr>
+          <w:p>
+            <w:pPr>
+              <w:spacing w:line="276" w:lineRule="auto"/>
+              <w:jc w:val="both"/>
+              <w:rPr>
+                <w:rFonts w:ascii="Times New Roman" w:hAnsi="Times New Roman" w:cs="Times New Roman"/>
+                <w:sz w:val="28"/>
+                <w:szCs w:val="28"/>
+                <w:lang w:val="en-US"/>
+              </w:rPr>
+            </w:pPr>
+            <w:r>
+              <w:rPr>
+                <w:rFonts w:ascii="Times New Roman" w:hAnsi="Times New Roman" w:cs="Times New Roman"/>
+                <w:sz w:val="28"/>
+                <w:szCs w:val="28"/>
+                <w:lang w:val="en-US"/>
+              </w:rPr>
+              <w:t>Noise</w:t>
+            </w:r>
+          </w:p>
+        </w:tc>
+        <w:tc>
+          <w:tcPr>
+            <w:tcW w:w="3578" w:type="dxa"/>
+          </w:tcPr>
+          <w:p>
+            <w:pPr>
+              <w:spacing w:line="276" w:lineRule="auto"/>
+              <w:jc w:val="both"/>
+              <w:rPr>
+                <w:rFonts w:ascii="Times New Roman" w:hAnsi="Times New Roman" w:cs="Times New Roman"/>
+                <w:sz w:val="28"/>
+                <w:szCs w:val="28"/>
+                <w:lang w:val="en-US"/>
+              </w:rPr>
+            </w:pPr>
+            <w:r>
+              <w:rPr>
+                <w:rFonts w:ascii="Times New Roman" w:hAnsi="Times New Roman" w:cs="Times New Roman"/>
+                <w:sz w:val="28"/>
+                <w:szCs w:val="28"/>
+              </w:rPr>
+              <w:t>Can make noise while operating</w:t>
+            </w:r>
+          </w:p>
+        </w:tc>
+        <w:tc>
+          <w:tcPr>
+            <w:tcW w:w="3240" w:type="dxa"/>
+          </w:tcPr>
+          <w:p>
+            <w:pPr>
+              <w:spacing w:line="276" w:lineRule="auto"/>
+              <w:jc w:val="both"/>
+              <w:rPr>
+                <w:rFonts w:ascii="Times New Roman" w:hAnsi="Times New Roman" w:cs="Times New Roman"/>
+                <w:sz w:val="28"/>
+                <w:szCs w:val="28"/>
+                <w:lang w:val="en-US"/>
+              </w:rPr>
+            </w:pPr>
+            <w:r>
+              <w:rPr>
+                <w:rFonts w:ascii="Times New Roman" w:hAnsi="Times New Roman" w:cs="Times New Roman"/>
+                <w:sz w:val="28"/>
+                <w:szCs w:val="28"/>
+              </w:rPr>
+              <w:t>Silent</w:t>
+            </w:r>
+          </w:p>
+        </w:tc>
+      </w:tr>
+      <w:tr>
+        <w:trPr>
+          <w:trHeight w:val="860"/>
+        </w:trPr>
+        <w:tc>
+          <w:tcPr>
+            <w:tcW w:w="2284" w:type="dxa"/>
+          </w:tcPr>
+          <w:p>
+            <w:pPr>
+              <w:spacing w:line="276" w:lineRule="auto"/>
+              <w:jc w:val="both"/>
+              <w:rPr>
+                <w:rFonts w:ascii="Times New Roman" w:hAnsi="Times New Roman" w:cs="Times New Roman"/>
+                <w:sz w:val="28"/>
+                <w:szCs w:val="28"/>
+                <w:lang w:val="en-US"/>
+              </w:rPr>
+            </w:pPr>
+            <w:r>
+              <w:rPr>
+                <w:rFonts w:ascii="Times New Roman" w:hAnsi="Times New Roman" w:cs="Times New Roman"/>
+                <w:sz w:val="28"/>
+                <w:szCs w:val="28"/>
+                <w:lang w:val="en-US"/>
+              </w:rPr>
+              <w:t>Typical</w:t>
+            </w:r>
+            <w:r>
+              <w:rPr>
+                <w:rFonts w:ascii="Times New Roman" w:hAnsi="Times New Roman" w:cs="Times New Roman"/>
+                <w:sz w:val="28"/>
+                <w:szCs w:val="28"/>
+                <w:lang w:val="en-US"/>
+              </w:rPr>
+              <w:t xml:space="preserve"> Use</w:t>
+            </w:r>
+          </w:p>
+        </w:tc>
+        <w:tc>
+          <w:tcPr>
+            <w:tcW w:w="3578" w:type="dxa"/>
+          </w:tcPr>
+          <w:p>
+            <w:pPr>
+              <w:spacing w:line="276" w:lineRule="auto"/>
+              <w:jc w:val="both"/>
+              <w:rPr>
+                <w:rFonts w:ascii="Times New Roman" w:hAnsi="Times New Roman" w:cs="Times New Roman"/>
+                <w:sz w:val="28"/>
+                <w:szCs w:val="28"/>
+                <w:lang w:val="en-US"/>
+              </w:rPr>
+            </w:pPr>
+            <w:r>
+              <w:rPr>
+                <w:rFonts w:ascii="Times New Roman" w:hAnsi="Times New Roman" w:cs="Times New Roman"/>
+                <w:sz w:val="28"/>
+                <w:szCs w:val="28"/>
+              </w:rPr>
+              <w:t>Desktop PCs, bulk storage, backups</w:t>
+            </w:r>
+          </w:p>
+        </w:tc>
+        <w:tc>
+          <w:tcPr>
+            <w:tcW w:w="3240" w:type="dxa"/>
+          </w:tcPr>
+          <w:p>
+            <w:pPr>
+              <w:spacing w:line="276" w:lineRule="auto"/>
+              <w:jc w:val="both"/>
+              <w:rPr>
+                <w:rFonts w:ascii="Times New Roman" w:hAnsi="Times New Roman" w:cs="Times New Roman"/>
+                <w:sz w:val="28"/>
+                <w:szCs w:val="28"/>
+                <w:lang w:val="en-US"/>
+              </w:rPr>
+            </w:pPr>
+            <w:r>
+              <w:rPr>
+                <w:rFonts w:ascii="Times New Roman" w:hAnsi="Times New Roman" w:cs="Times New Roman"/>
+                <w:sz w:val="28"/>
+                <w:szCs w:val="28"/>
+              </w:rPr>
+              <w:t>Laptops, gaming PCs, modern computers</w:t>
+            </w:r>
+          </w:p>
+        </w:tc>
+      </w:tr>
+      <w:tr>
+        <w:trPr>
+          <w:trHeight w:val="566"/>
+        </w:trPr>
+        <w:tc>
+          <w:tcPr>
+            <w:tcW w:w="2284" w:type="dxa"/>
+          </w:tcPr>
+          <w:p>
+            <w:pPr>
+              <w:spacing w:line="276" w:lineRule="auto"/>
+              <w:jc w:val="both"/>
+              <w:rPr>
+                <w:rFonts w:ascii="Times New Roman" w:hAnsi="Times New Roman" w:cs="Times New Roman"/>
+                <w:sz w:val="28"/>
+                <w:szCs w:val="28"/>
+                <w:lang w:val="en-US"/>
+              </w:rPr>
+            </w:pPr>
+            <w:r>
+              <w:rPr>
+                <w:rFonts w:ascii="Times New Roman" w:hAnsi="Times New Roman" w:cs="Times New Roman"/>
+                <w:sz w:val="28"/>
+                <w:szCs w:val="28"/>
+                <w:lang w:val="en-US"/>
+              </w:rPr>
+              <w:t>Cost</w:t>
+            </w:r>
+          </w:p>
+        </w:tc>
+        <w:tc>
+          <w:tcPr>
+            <w:tcW w:w="3578" w:type="dxa"/>
+          </w:tcPr>
+          <w:p>
+            <w:pPr>
+              <w:spacing w:line="276" w:lineRule="auto"/>
+              <w:jc w:val="both"/>
+              <w:rPr>
+                <w:rFonts w:ascii="Times New Roman" w:hAnsi="Times New Roman" w:cs="Times New Roman"/>
+                <w:sz w:val="28"/>
+                <w:szCs w:val="28"/>
+                <w:lang w:val="en-US"/>
+              </w:rPr>
+            </w:pPr>
+            <w:r>
+              <w:rPr>
+                <w:rFonts w:ascii="Times New Roman" w:hAnsi="Times New Roman" w:cs="Times New Roman"/>
+                <w:sz w:val="28"/>
+                <w:szCs w:val="28"/>
+              </w:rPr>
+              <w:t>Usually cheaper per GB</w:t>
+            </w:r>
+          </w:p>
+        </w:tc>
+        <w:tc>
+          <w:tcPr>
+            <w:tcW w:w="3240" w:type="dxa"/>
+          </w:tcPr>
+          <w:p>
+            <w:pPr>
+              <w:spacing w:line="276" w:lineRule="auto"/>
+              <w:jc w:val="both"/>
+              <w:rPr>
+                <w:rFonts w:ascii="Times New Roman" w:hAnsi="Times New Roman" w:cs="Times New Roman"/>
+                <w:sz w:val="28"/>
+                <w:szCs w:val="28"/>
+                <w:lang w:val="en-US"/>
+              </w:rPr>
+            </w:pPr>
+            <w:r>
+              <w:rPr>
+                <w:rFonts w:ascii="Times New Roman" w:hAnsi="Times New Roman" w:cs="Times New Roman"/>
+                <w:sz w:val="28"/>
+                <w:szCs w:val="28"/>
+              </w:rPr>
+              <w:t>Usually more expensive per GB</w:t>
+            </w:r>
+          </w:p>
+        </w:tc>
+      </w:tr>
+      <w:tr>
+        <w:trPr>
+          <w:trHeight w:val="457"/>
+        </w:trPr>
+        <w:tc>
+          <w:tcPr>
+            <w:tcW w:w="2284" w:type="dxa"/>
+          </w:tcPr>
+          <w:p>
+            <w:pPr>
+              <w:spacing w:line="276" w:lineRule="auto"/>
+              <w:jc w:val="both"/>
+              <w:rPr>
+                <w:rFonts w:ascii="Times New Roman" w:hAnsi="Times New Roman" w:cs="Times New Roman"/>
+                <w:sz w:val="28"/>
+                <w:szCs w:val="28"/>
+                <w:lang w:val="en-US"/>
+              </w:rPr>
+            </w:pPr>
+            <w:r>
+              <w:rPr>
+                <w:rFonts w:ascii="Times New Roman" w:hAnsi="Times New Roman" w:cs="Times New Roman"/>
+                <w:sz w:val="28"/>
+                <w:szCs w:val="28"/>
+                <w:lang w:val="en-US"/>
+              </w:rPr>
+              <w:t>Best For</w:t>
+            </w:r>
+          </w:p>
+        </w:tc>
+        <w:tc>
+          <w:tcPr>
+            <w:tcW w:w="3578" w:type="dxa"/>
+          </w:tcPr>
+          <w:p>
+            <w:pPr>
+              <w:spacing w:line="276" w:lineRule="auto"/>
+              <w:jc w:val="both"/>
+              <w:rPr>
+                <w:rFonts w:ascii="Times New Roman" w:hAnsi="Times New Roman" w:cs="Times New Roman"/>
+                <w:sz w:val="28"/>
+                <w:szCs w:val="28"/>
+                <w:lang w:val="en-US"/>
+              </w:rPr>
+            </w:pPr>
+            <w:r>
+              <w:rPr>
+                <w:rFonts w:ascii="Times New Roman" w:hAnsi="Times New Roman" w:cs="Times New Roman"/>
+                <w:sz w:val="28"/>
+                <w:szCs w:val="28"/>
+              </w:rPr>
+              <w:t>Large-capacity, low-cost storage</w:t>
+            </w:r>
+            <w:r>
+              <w:rPr>
+                <w:rFonts w:ascii="Times New Roman" w:hAnsi="Times New Roman" w:cs="Times New Roman"/>
+                <w:sz w:val="28"/>
+                <w:szCs w:val="28"/>
+              </w:rPr>
+              <w:t>.</w:t>
+            </w:r>
+          </w:p>
+        </w:tc>
+        <w:tc>
+          <w:tcPr>
+            <w:tcW w:w="3240" w:type="dxa"/>
+          </w:tcPr>
+          <w:p>
+            <w:pPr>
+              <w:spacing w:line="276" w:lineRule="auto"/>
+              <w:jc w:val="both"/>
+              <w:rPr>
+                <w:rFonts w:ascii="Times New Roman" w:hAnsi="Times New Roman" w:cs="Times New Roman"/>
+                <w:sz w:val="28"/>
+                <w:szCs w:val="28"/>
+                <w:lang w:val="en-US"/>
+              </w:rPr>
+            </w:pPr>
+            <w:r>
+              <w:rPr>
+                <w:rFonts w:ascii="Times New Roman" w:hAnsi="Times New Roman" w:cs="Times New Roman"/>
+                <w:sz w:val="28"/>
+                <w:szCs w:val="28"/>
+              </w:rPr>
+              <w:t>Fast booting, gaming, apps, and everyday performance</w:t>
+            </w:r>
+            <w:r>
+              <w:rPr>
+                <w:rFonts w:ascii="Times New Roman" w:hAnsi="Times New Roman" w:cs="Times New Roman"/>
+                <w:sz w:val="28"/>
+                <w:szCs w:val="28"/>
+              </w:rPr>
+              <w:t>.</w:t>
+            </w:r>
+          </w:p>
+        </w:tc>
+      </w:tr>
+    </w:tbl>
+    <w:p>
+      <w:pPr>
+        <w:spacing w:line="276" w:lineRule="auto"/>
+        <w:rPr>
+          <w:rFonts w:ascii="Times New Roman" w:hAnsi="Times New Roman" w:cs="Times New Roman"/>
+          <w:b/>
+          <w:bCs/>
+          <w:sz w:val="28"/>
+          <w:szCs w:val="28"/>
+        </w:rPr>
+      </w:pPr>
+      <w:r>
+        <w:rPr>
+          <w:rFonts w:ascii="Times New Roman" w:hAnsi="Times New Roman" w:cs="Times New Roman"/>
+          <w:sz w:val="44"/>
+          <w:szCs w:val="44"/>
+          <w:lang w:val="en-US"/>
+        </w:rPr>
+        <w:br/>
+      </w:r>
+      <w:r>
+        <w:rPr>
+          <w:rFonts w:ascii="Times New Roman" w:hAnsi="Times New Roman" w:cs="Times New Roman"/>
+          <w:b/>
+          <w:bCs/>
+          <w:sz w:val="28"/>
+          <w:szCs w:val="28"/>
+        </w:rPr>
+        <w:br/>
+      </w:r>
+      <w:r>
+        <w:rPr>
+          <w:rFonts w:ascii="Times New Roman" w:hAnsi="Times New Roman" w:cs="Times New Roman"/>
+          <w:b/>
+          <w:bCs/>
+          <w:sz w:val="28"/>
+          <w:szCs w:val="28"/>
+        </w:rPr>
+        <w:br/>
+      </w:r>
+    </w:p>
+    <w:p>
+      <w:pPr>
+        <w:spacing w:line="276" w:lineRule="auto"/>
+        <w:rPr>
+          <w:rFonts w:ascii="Times New Roman" w:hAnsi="Times New Roman" w:cs="Times New Roman"/>
+          <w:b/>
+          <w:bCs/>
+          <w:sz w:val="28"/>
+          <w:szCs w:val="28"/>
+        </w:rPr>
+      </w:pPr>
+    </w:p>
+    <w:p>
+      <w:pPr>
+        <w:spacing w:line="276" w:lineRule="auto"/>
+        <w:rPr>
+          <w:rFonts w:ascii="Times New Roman" w:hAnsi="Times New Roman" w:cs="Times New Roman"/>
+          <w:b/>
+          <w:bCs/>
+          <w:sz w:val="28"/>
+          <w:szCs w:val="28"/>
+        </w:rPr>
+      </w:pPr>
+    </w:p>
+    <w:p>
+      <w:pPr>
+        <w:spacing w:line="276" w:lineRule="auto"/>
+        <w:rPr>
+          <w:rFonts w:ascii="Times New Roman" w:hAnsi="Times New Roman" w:cs="Times New Roman"/>
+          <w:b/>
+          <w:bCs/>
+          <w:sz w:val="28"/>
+          <w:szCs w:val="28"/>
+        </w:rPr>
+      </w:pPr>
+    </w:p>
+    <w:p>
+      <w:pPr>
+        <w:spacing w:line="276" w:lineRule="auto"/>
+        <w:rPr>
+          <w:rFonts w:ascii="Times New Roman" w:hAnsi="Times New Roman" w:cs="Times New Roman"/>
+          <w:b/>
+          <w:bCs/>
+          <w:sz w:val="28"/>
+          <w:szCs w:val="28"/>
+        </w:rPr>
+      </w:pPr>
+    </w:p>
+    <w:p>
+      <w:pPr>
+        <w:spacing w:line="276" w:lineRule="auto"/>
+        <w:rPr>
+          <w:rFonts w:ascii="Times New Roman" w:hAnsi="Times New Roman" w:cs="Times New Roman"/>
+          <w:b/>
+          <w:bCs/>
+          <w:sz w:val="28"/>
+          <w:szCs w:val="28"/>
+        </w:rPr>
+      </w:pPr>
+    </w:p>
+    <w:p>
+      <w:pPr>
+        <w:spacing w:line="276" w:lineRule="auto"/>
+        <w:rPr>
+          <w:rFonts w:ascii="Times New Roman" w:hAnsi="Times New Roman" w:cs="Times New Roman"/>
+          <w:b/>
+          <w:bCs/>
+          <w:sz w:val="28"/>
+          <w:szCs w:val="28"/>
+        </w:rPr>
+      </w:pPr>
+    </w:p>
+    <w:p>
+      <w:pPr>
+        <w:spacing w:line="276" w:lineRule="auto"/>
+        <w:rPr>
+          <w:rFonts w:ascii="Times New Roman" w:hAnsi="Times New Roman" w:cs="Times New Roman"/>
+          <w:b/>
+          <w:bCs/>
+          <w:sz w:val="28"/>
+          <w:szCs w:val="28"/>
+        </w:rPr>
+      </w:pPr>
+      <w:r>
+        <w:rPr>
+          <w:rFonts w:ascii="Times New Roman" w:hAnsi="Times New Roman" w:cs="Times New Roman"/>
+          <w:b/>
+          <w:bCs/>
+          <w:sz w:val="28"/>
+          <w:szCs w:val="28"/>
+        </w:rPr>
+        <w:lastRenderedPageBreak/>
+        <w:t>3.</w:t>
+      </w:r>
+      <w:r>
+        <w:rPr>
+          <w:rFonts w:ascii="Times New Roman" w:hAnsi="Times New Roman" w:cs="Times New Roman"/>
+          <w:sz w:val="28"/>
+          <w:szCs w:val="28"/>
+        </w:rPr>
+        <w:t>Write a short explanation (2-3 sentences each) describing the role of the CPU, RAM, and GPU in running a game like PUBG or Free Fire on a PC</w:t>
+      </w:r>
+      <w:r>
+        <w:rPr>
+          <w:rFonts w:ascii="Times New Roman" w:hAnsi="Times New Roman" w:cs="Times New Roman"/>
+          <w:sz w:val="28"/>
+          <w:szCs w:val="28"/>
+        </w:rPr>
+        <w:t>.</w:t>
+      </w:r>
+      <w:r>
+        <w:rPr>
+          <w:rFonts w:ascii="Times New Roman" w:hAnsi="Times New Roman" w:cs="Times New Roman"/>
+          <w:sz w:val="28"/>
+          <w:szCs w:val="28"/>
+        </w:rPr>
+        <w:br/>
+      </w:r>
+      <w:r>
+        <w:rPr>
+          <w:rFonts w:ascii="Times New Roman" w:hAnsi="Times New Roman" w:cs="Times New Roman"/>
+          <w:b/>
+          <w:bCs/>
+          <w:sz w:val="28"/>
+          <w:szCs w:val="28"/>
+        </w:rPr>
+        <w:br/>
+      </w:r>
+      <w:r>
+        <w:rPr>
+          <w:rFonts w:ascii="Times New Roman" w:hAnsi="Times New Roman" w:cs="Times New Roman"/>
+          <w:b/>
+          <w:bCs/>
+          <w:sz w:val="28"/>
+          <w:szCs w:val="28"/>
+        </w:rPr>
+        <w:t>CPU (Central Processing Unit):</w:t>
+      </w:r>
+      <w:r>
+        <w:rPr>
+          <w:rFonts w:ascii="Times New Roman" w:hAnsi="Times New Roman" w:cs="Times New Roman"/>
+          <w:sz w:val="28"/>
+          <w:szCs w:val="28"/>
+        </w:rPr>
+        <w:br/>
+        <w:t>The CPU handles the game's main calculations, game logic, player movements, and system tasks. It helps the game run smoothly by processing instructions quickly.</w:t>
+      </w:r>
+    </w:p>
+    <w:p>
+      <w:pPr>
+        <w:spacing w:line="276" w:lineRule="auto"/>
+        <w:rPr>
+          <w:rFonts w:ascii="Times New Roman" w:hAnsi="Times New Roman" w:cs="Times New Roman"/>
+          <w:sz w:val="28"/>
+          <w:szCs w:val="28"/>
+        </w:rPr>
+      </w:pPr>
+      <w:r>
+        <w:rPr>
+          <w:rFonts w:ascii="Times New Roman" w:hAnsi="Times New Roman" w:cs="Times New Roman"/>
+          <w:b/>
+          <w:bCs/>
+          <w:sz w:val="28"/>
+          <w:szCs w:val="28"/>
+        </w:rPr>
+        <w:t>RAM (Random Access Memory):</w:t>
+      </w:r>
+      <w:r>
+        <w:rPr>
+          <w:rFonts w:ascii="Times New Roman" w:hAnsi="Times New Roman" w:cs="Times New Roman"/>
+          <w:sz w:val="28"/>
+          <w:szCs w:val="28"/>
+        </w:rPr>
+        <w:br/>
+        <w:t>RAM temporarily stores the data and instructions that the game needs while running. More RAM helps the game run smoothly and reduces slowdowns when other applications are also open.</w:t>
+      </w:r>
+    </w:p>
+    <w:p>
+      <w:pPr>
+        <w:spacing w:line="276" w:lineRule="auto"/>
+        <w:rPr>
+          <w:rFonts w:ascii="Times New Roman" w:hAnsi="Times New Roman" w:cs="Times New Roman"/>
+          <w:sz w:val="28"/>
+          <w:szCs w:val="28"/>
+        </w:rPr>
+      </w:pPr>
+      <w:r>
+        <w:rPr>
+          <w:rFonts w:ascii="Times New Roman" w:hAnsi="Times New Roman" w:cs="Times New Roman"/>
+          <w:b/>
+          <w:bCs/>
+          <w:sz w:val="28"/>
+          <w:szCs w:val="28"/>
+        </w:rPr>
+        <w:t>GPU (Graphics Processing Unit):</w:t>
+      </w:r>
+      <w:r>
+        <w:rPr>
+          <w:rFonts w:ascii="Times New Roman" w:hAnsi="Times New Roman" w:cs="Times New Roman"/>
+          <w:sz w:val="28"/>
+          <w:szCs w:val="28"/>
+        </w:rPr>
+        <w:br/>
+        <w:t>The GPU renders the game's graphics, including characters, environments, textures, and visual effects. A powerful GPU provides better graphics quality and higher, smoother frame rates.</w:t>
+      </w:r>
+    </w:p>
+    <w:p>
+      <w:pPr>
+        <w:spacing w:line="276" w:lineRule="auto"/>
+        <w:rPr>
+          <w:rFonts w:ascii="Times New Roman" w:hAnsi="Times New Roman" w:cs="Times New Roman"/>
+          <w:b/>
+          <w:bCs/>
+          <w:sz w:val="28"/>
+          <w:szCs w:val="28"/>
+        </w:rPr>
+      </w:pPr>
+      <w:r>
+        <w:rPr>
+          <w:rFonts w:ascii="Times New Roman" w:hAnsi="Times New Roman" w:cs="Times New Roman"/>
+          <w:sz w:val="28"/>
+          <w:szCs w:val="28"/>
+        </w:rPr>
+        <w:br/>
+      </w:r>
+      <w:r>
+        <w:rPr>
+          <w:rFonts w:ascii="Times New Roman" w:hAnsi="Times New Roman" w:cs="Times New Roman"/>
+          <w:b/>
+          <w:bCs/>
+          <w:sz w:val="28"/>
+          <w:szCs w:val="28"/>
+        </w:rPr>
+        <w:t>4.</w:t>
+      </w:r>
+      <w:r>
+        <w:rPr>
+          <w:rFonts w:ascii="Times New Roman" w:hAnsi="Times New Roman" w:cs="Times New Roman"/>
+          <w:sz w:val="28"/>
+          <w:szCs w:val="28"/>
+        </w:rPr>
+        <w:t>Imagine you want to upgrade your PC to run the latest version of FIFA smoothly. List which hardware components you would consider upgrading and explain why for each</w:t>
+      </w:r>
+      <w:r>
+        <w:rPr>
+          <w:rFonts w:ascii="Times New Roman" w:hAnsi="Times New Roman" w:cs="Times New Roman"/>
+          <w:b/>
+          <w:bCs/>
+          <w:sz w:val="28"/>
+          <w:szCs w:val="28"/>
+        </w:rPr>
+        <w:t xml:space="preserve">. </w:t>
+      </w:r>
+    </w:p>
+    <w:tbl>
+      <w:tblPr>
+        <w:tblStyle w:val="TableGrid"/>
+        <w:tblW w:w="0" w:type="auto"/>
+        <w:tblLook w:val="04A0" w:firstRow="1" w:lastRow="0" w:firstColumn="1" w:lastColumn="0" w:noHBand="0" w:noVBand="1"/>
+      </w:tblPr>
+      <w:tblGrid>
+        <w:gridCol w:w="2972"/>
+        <w:gridCol w:w="6044"/>
+      </w:tblGrid>
+      <w:tr>
+        <w:tc>
+          <w:tcPr>
+            <w:tcW w:w="2972" w:type="dxa"/>
+          </w:tcPr>
+          <w:p>
+            <w:pPr>
+              <w:spacing w:line="276" w:lineRule="auto"/>
+              <w:rPr>
+                <w:rFonts w:ascii="Times New Roman" w:hAnsi="Times New Roman" w:cs="Times New Roman"/>
+                <w:b/>
+                <w:bCs/>
+                <w:sz w:val="28"/>
+                <w:szCs w:val="28"/>
+              </w:rPr>
+            </w:pPr>
+            <w:r>
+              <w:rPr>
+                <w:rFonts w:ascii="Times New Roman" w:hAnsi="Times New Roman" w:cs="Times New Roman"/>
+                <w:b/>
+                <w:bCs/>
+                <w:sz w:val="28"/>
+                <w:szCs w:val="28"/>
+              </w:rPr>
+              <w:t>Hardware Component</w:t>
+            </w:r>
+          </w:p>
+        </w:tc>
+        <w:tc>
+          <w:tcPr>
+            <w:tcW w:w="6044" w:type="dxa"/>
+          </w:tcPr>
+          <w:p>
+            <w:pPr>
+              <w:spacing w:line="276" w:lineRule="auto"/>
+              <w:rPr>
+                <w:rFonts w:ascii="Times New Roman" w:hAnsi="Times New Roman" w:cs="Times New Roman"/>
+                <w:b/>
+                <w:bCs/>
+                <w:sz w:val="28"/>
+                <w:szCs w:val="28"/>
+              </w:rPr>
+            </w:pPr>
+            <w:r>
+              <w:rPr>
+                <w:rFonts w:ascii="Times New Roman" w:hAnsi="Times New Roman" w:cs="Times New Roman"/>
+                <w:b/>
+                <w:bCs/>
+                <w:sz w:val="28"/>
+                <w:szCs w:val="28"/>
+              </w:rPr>
+              <w:t>Why Upgrade It?</w:t>
+            </w:r>
+          </w:p>
+        </w:tc>
+      </w:tr>
+      <w:tr>
+        <w:tc>
+          <w:tcPr>
+            <w:tcW w:w="2972" w:type="dxa"/>
+          </w:tcPr>
+          <w:p>
+            <w:pPr>
+              <w:spacing w:line="276" w:lineRule="auto"/>
+              <w:rPr>
+                <w:rFonts w:ascii="Times New Roman" w:hAnsi="Times New Roman" w:cs="Times New Roman"/>
+                <w:b/>
+                <w:bCs/>
+                <w:sz w:val="28"/>
+                <w:szCs w:val="28"/>
+              </w:rPr>
+            </w:pPr>
+            <w:r>
+              <w:rPr>
+                <w:rFonts w:ascii="Times New Roman" w:hAnsi="Times New Roman" w:cs="Times New Roman"/>
+                <w:b/>
+                <w:bCs/>
+                <w:sz w:val="28"/>
+                <w:szCs w:val="28"/>
+              </w:rPr>
+              <w:t>GPU (Graphics Card)</w:t>
+            </w:r>
+          </w:p>
+        </w:tc>
+        <w:tc>
+          <w:tcPr>
+            <w:tcW w:w="6044" w:type="dxa"/>
+          </w:tcPr>
+          <w:p>
+            <w:pPr>
+              <w:spacing w:line="276" w:lineRule="auto"/>
+              <w:rPr>
+                <w:rFonts w:ascii="Times New Roman" w:hAnsi="Times New Roman" w:cs="Times New Roman"/>
+                <w:b/>
+                <w:bCs/>
+                <w:sz w:val="28"/>
+                <w:szCs w:val="28"/>
+              </w:rPr>
+            </w:pPr>
+            <w:r>
+              <w:rPr>
+                <w:rFonts w:ascii="Times New Roman" w:hAnsi="Times New Roman" w:cs="Times New Roman"/>
+                <w:sz w:val="28"/>
+                <w:szCs w:val="28"/>
+              </w:rPr>
+              <w:t>A powerful GPU improves graphics quality and provides smoother FPS during gameplay.</w:t>
+            </w:r>
+          </w:p>
+        </w:tc>
+      </w:tr>
+      <w:tr>
+        <w:tc>
+          <w:tcPr>
+            <w:tcW w:w="2972" w:type="dxa"/>
+          </w:tcPr>
+          <w:p>
+            <w:pPr>
+              <w:spacing w:line="276" w:lineRule="auto"/>
+              <w:rPr>
+                <w:rFonts w:ascii="Times New Roman" w:hAnsi="Times New Roman" w:cs="Times New Roman"/>
+                <w:b/>
+                <w:bCs/>
+                <w:sz w:val="28"/>
+                <w:szCs w:val="28"/>
+              </w:rPr>
+            </w:pPr>
+            <w:r>
+              <w:rPr>
+                <w:rFonts w:ascii="Times New Roman" w:hAnsi="Times New Roman" w:cs="Times New Roman"/>
+                <w:b/>
+                <w:bCs/>
+                <w:sz w:val="28"/>
+                <w:szCs w:val="28"/>
+              </w:rPr>
+              <w:t>CPU (Processor)</w:t>
+            </w:r>
+          </w:p>
+        </w:tc>
+        <w:tc>
+          <w:tcPr>
+            <w:tcW w:w="6044" w:type="dxa"/>
+            <w:vAlign w:val="center"/>
+          </w:tcPr>
+          <w:p>
+            <w:pPr>
+              <w:spacing w:line="276" w:lineRule="auto"/>
+              <w:rPr>
+                <w:rFonts w:ascii="Times New Roman" w:hAnsi="Times New Roman" w:cs="Times New Roman"/>
+                <w:b/>
+                <w:bCs/>
+                <w:sz w:val="28"/>
+                <w:szCs w:val="28"/>
+              </w:rPr>
+            </w:pPr>
+            <w:r>
+              <w:rPr>
+                <w:rFonts w:ascii="Times New Roman" w:hAnsi="Times New Roman" w:cs="Times New Roman"/>
+                <w:sz w:val="28"/>
+                <w:szCs w:val="28"/>
+              </w:rPr>
+              <w:t>A faster CPU helps process game physics, player movements, AI, and other game calculations efficiently.</w:t>
+            </w:r>
+          </w:p>
+        </w:tc>
+      </w:tr>
+      <w:tr>
+        <w:tc>
+          <w:tcPr>
+            <w:tcW w:w="2972" w:type="dxa"/>
+          </w:tcPr>
+          <w:p>
+            <w:pPr>
+              <w:spacing w:line="276" w:lineRule="auto"/>
+              <w:rPr>
+                <w:rFonts w:ascii="Times New Roman" w:hAnsi="Times New Roman" w:cs="Times New Roman"/>
+                <w:b/>
+                <w:bCs/>
+                <w:sz w:val="28"/>
+                <w:szCs w:val="28"/>
+              </w:rPr>
+            </w:pPr>
+            <w:r>
+              <w:rPr>
+                <w:rFonts w:ascii="Times New Roman" w:hAnsi="Times New Roman" w:cs="Times New Roman"/>
+                <w:b/>
+                <w:bCs/>
+                <w:sz w:val="28"/>
+                <w:szCs w:val="28"/>
+              </w:rPr>
+              <w:t>RAM</w:t>
+            </w:r>
+          </w:p>
+        </w:tc>
+        <w:tc>
+          <w:tcPr>
+            <w:tcW w:w="6044" w:type="dxa"/>
+          </w:tcPr>
+          <w:p>
+            <w:pPr>
+              <w:spacing w:line="276" w:lineRule="auto"/>
+              <w:rPr>
+                <w:rFonts w:ascii="Times New Roman" w:hAnsi="Times New Roman" w:cs="Times New Roman"/>
+                <w:b/>
+                <w:bCs/>
+                <w:sz w:val="28"/>
+                <w:szCs w:val="28"/>
+              </w:rPr>
+            </w:pPr>
+            <w:r>
+              <w:rPr>
+                <w:rFonts w:ascii="Times New Roman" w:hAnsi="Times New Roman" w:cs="Times New Roman"/>
+                <w:sz w:val="28"/>
+                <w:szCs w:val="28"/>
+              </w:rPr>
+              <w:t>Increasing RAM helps the game run smoothly and reduces lag when other applications are running in the background.</w:t>
+            </w:r>
+          </w:p>
+        </w:tc>
+      </w:tr>
+      <w:tr>
+        <w:tc>
+          <w:tcPr>
+            <w:tcW w:w="2972" w:type="dxa"/>
+          </w:tcPr>
+          <w:p>
+            <w:pPr>
+              <w:spacing w:line="276" w:lineRule="auto"/>
+              <w:rPr>
+                <w:rFonts w:ascii="Times New Roman" w:hAnsi="Times New Roman" w:cs="Times New Roman"/>
+                <w:b/>
+                <w:bCs/>
+                <w:sz w:val="28"/>
+                <w:szCs w:val="28"/>
+              </w:rPr>
+            </w:pPr>
+            <w:r>
+              <w:rPr>
+                <w:rFonts w:ascii="Times New Roman" w:hAnsi="Times New Roman" w:cs="Times New Roman"/>
+                <w:b/>
+                <w:bCs/>
+                <w:sz w:val="28"/>
+                <w:szCs w:val="28"/>
+              </w:rPr>
+              <w:t>SSD</w:t>
+            </w:r>
+          </w:p>
+        </w:tc>
+        <w:tc>
+          <w:tcPr>
+            <w:tcW w:w="6044" w:type="dxa"/>
+          </w:tcPr>
+          <w:p>
+            <w:pPr>
+              <w:spacing w:line="276" w:lineRule="auto"/>
+              <w:rPr>
+                <w:rFonts w:ascii="Times New Roman" w:hAnsi="Times New Roman" w:cs="Times New Roman"/>
+                <w:b/>
+                <w:bCs/>
+                <w:sz w:val="28"/>
+                <w:szCs w:val="28"/>
+              </w:rPr>
+            </w:pPr>
+            <w:r>
+              <w:rPr>
+                <w:rFonts w:ascii="Times New Roman" w:hAnsi="Times New Roman" w:cs="Times New Roman"/>
+                <w:sz w:val="28"/>
+                <w:szCs w:val="28"/>
+              </w:rPr>
+              <w:t>Installing the game on an SSD improves loading times and makes the overall system feel more responsive.</w:t>
+            </w:r>
+          </w:p>
+        </w:tc>
+      </w:tr>
+      <w:tr>
+        <w:tc>
+          <w:tcPr>
+            <w:tcW w:w="2972" w:type="dxa"/>
+          </w:tcPr>
+          <w:p>
+            <w:pPr>
+              <w:spacing w:line="276" w:lineRule="auto"/>
+              <w:rPr>
+                <w:rFonts w:ascii="Times New Roman" w:hAnsi="Times New Roman" w:cs="Times New Roman"/>
+                <w:b/>
+                <w:bCs/>
+                <w:sz w:val="28"/>
+                <w:szCs w:val="28"/>
+              </w:rPr>
+            </w:pPr>
+            <w:r>
+              <w:rPr>
+                <w:rFonts w:ascii="Times New Roman" w:hAnsi="Times New Roman" w:cs="Times New Roman"/>
+                <w:b/>
+                <w:bCs/>
+                <w:sz w:val="28"/>
+                <w:szCs w:val="28"/>
+              </w:rPr>
+              <w:t>Power Supply (PSU)</w:t>
+            </w:r>
+          </w:p>
+        </w:tc>
+        <w:tc>
+          <w:tcPr>
+            <w:tcW w:w="6044" w:type="dxa"/>
+            <w:vAlign w:val="center"/>
+          </w:tcPr>
+          <w:p>
+            <w:pPr>
+              <w:spacing w:line="276" w:lineRule="auto"/>
+              <w:rPr>
+                <w:rFonts w:ascii="Times New Roman" w:hAnsi="Times New Roman" w:cs="Times New Roman"/>
+                <w:b/>
+                <w:bCs/>
+                <w:sz w:val="28"/>
+                <w:szCs w:val="28"/>
+              </w:rPr>
+            </w:pPr>
+            <w:r>
+              <w:rPr>
+                <w:rFonts w:ascii="Times New Roman" w:hAnsi="Times New Roman" w:cs="Times New Roman"/>
+                <w:sz w:val="28"/>
+                <w:szCs w:val="28"/>
+              </w:rPr>
+              <w:t>If upgrading to a powerful GPU or CPU, a suitable PSU may be needed to provide enough stable power to the components.</w:t>
+            </w:r>
+          </w:p>
+        </w:tc>
+      </w:tr>
+    </w:tbl>
+    <w:p>
+      <w:pPr>
+        <w:spacing w:line="276" w:lineRule="auto"/>
+        <w:rPr>
+          <w:rFonts w:ascii="Times New Roman" w:hAnsi="Times New Roman" w:cs="Times New Roman"/>
+          <w:b/>
+          <w:bCs/>
+          <w:sz w:val="28"/>
+          <w:szCs w:val="28"/>
+        </w:rPr>
+      </w:pPr>
+    </w:p>
     <w:sectPr>
       <w:pgSz w:w="11906" w:h="16838"/>
       <w:pgMar w:top="1440" w:right="1440" w:bottom="1440" w:left="1440" w:header="708" w:footer="708" w:gutter="0"/>
@@ -302,6 +1889,56 @@
     </w:sectPr>
   </w:body>
 </w:document>
+</file>
+
+<file path=word/endnotes.xml><?xml version="1.0" encoding="utf-8"?>
+<w:endnotes xmlns:wpc="http://schemas.microsoft.com/office/word/2010/wordprocessingCanvas" xmlns:cx="http://schemas.microsoft.com/office/drawing/2014/chartex" xmlns:cx1="http://schemas.microsoft.com/office/drawing/2015/9/8/chartex" xmlns:cx2="http://schemas.microsoft.com/office/drawing/2015/10/21/chartex" xmlns:cx3="http://schemas.microsoft.com/office/drawing/2016/5/9/chartex" xmlns:cx4="http://schemas.microsoft.com/office/drawing/2016/5/10/chartex" xmlns:cx5="http://schemas.microsoft.com/office/drawing/2016/5/11/chartex" xmlns:cx6="http://schemas.microsoft.com/office/drawing/2016/5/12/chartex" xmlns:cx7="http://schemas.microsoft.com/office/drawing/2016/5/13/chartex" xmlns:cx8="http://schemas.microsoft.com/office/drawing/2016/5/14/chartex" xmlns:mc="http://schemas.openxmlformats.org/markup-compatibility/2006" xmlns:aink="http://schemas.microsoft.com/office/drawing/2016/ink" xmlns:am3d="http://schemas.microsoft.com/office/drawing/2017/model3d" xmlns:o="urn:schemas-microsoft-com:office:office" xmlns:oel="http://schemas.microsoft.com/office/2019/extlst" xmlns:r="http://schemas.openxmlformats.org/officeDocument/2006/relationships" xmlns:m="http://schemas.openxmlformats.org/officeDocument/2006/math" xmlns:v="urn:schemas-microsoft-com:vml" xmlns:wp14="http://schemas.microsoft.com/office/word/2010/wordprocessingDrawing" xmlns:wp="http://schemas.openxmlformats.org/drawingml/2006/wordprocessingDrawing" xmlns:w10="urn:schemas-microsoft-com:office:word" xmlns:w="http://schemas.openxmlformats.org/wordprocessingml/2006/main" xmlns:w14="http://schemas.microsoft.com/office/word/2010/wordml" xmlns:w15="http://schemas.microsoft.com/office/word/2012/wordml" xmlns:w16cex="http://schemas.microsoft.com/office/word/2018/wordml/cex" xmlns:w16cid="http://schemas.microsoft.com/office/word/2016/wordml/cid" xmlns:w16="http://schemas.microsoft.com/office/word/2018/wordml" xmlns:w16du="http://schemas.microsoft.com/office/word/2023/wordml/word16du" xmlns:w16sdtdh="http://schemas.microsoft.com/office/word/2020/wordml/sdtdatahash" xmlns:w16sdtfl="http://schemas.microsoft.com/office/word/2024/wordml/sdtformatlock" xmlns:w16se="http://schemas.microsoft.com/office/word/2015/wordml/symex" xmlns:wpg="http://schemas.microsoft.com/office/word/2010/wordprocessingGroup" xmlns:wpi="http://schemas.microsoft.com/office/word/2010/wordprocessingInk" xmlns:wne="http://schemas.microsoft.com/office/word/2006/wordml" xmlns:wps="http://schemas.microsoft.com/office/word/2010/wordprocessingShape" mc:Ignorable="w14 w15 w16se w16cid w16 w16cex w16sdtdh w16sdtfl w16du wp14">
+  <w:endnote w:type="separator" w:id="-1">
+    <w:p>
+      <w:pPr>
+        <w:spacing w:after="0" w:line="240" w:lineRule="auto"/>
+      </w:pPr>
+      <w:r>
+        <w:separator/>
+      </w:r>
+    </w:p>
+  </w:endnote>
+  <w:endnote w:type="continuationSeparator" w:id="0">
+    <w:p>
+      <w:pPr>
+        <w:spacing w:after="0" w:line="240" w:lineRule="auto"/>
+      </w:pPr>
+      <w:r>
+        <w:continuationSeparator/>
+      </w:r>
+    </w:p>
+  </w:endnote>
+</w:endnotes>
+</file>
+
+<file path=word/footnotes.xml><?xml version="1.0" encoding="utf-8"?>
+<w:footnotes xmlns:wpc="http://schemas.microsoft.com/office/word/2010/wordprocessingCanvas" xmlns:cx="http://schemas.microsoft.com/office/drawing/2014/chartex" xmlns:cx1="http://schemas.microsoft.com/office/drawing/2015/9/8/chartex" xmlns:cx2="http://schemas.microsoft.com/office/drawing/2015/10/21/chartex" xmlns:cx3="http://schemas.microsoft.com/office/drawing/2016/5/9/chartex" xmlns:cx4="http://schemas.microsoft.com/office/drawing/2016/5/10/chartex" xmlns:cx5="http://schemas.microsoft.com/office/drawing/2016/5/11/chartex" xmlns:cx6="http://schemas.microsoft.com/office/drawing/2016/5/12/chartex" xmlns:cx7="http://schemas.microsoft.com/office/drawing/2016/5/13/chartex" xmlns:cx8="http://schemas.microsoft.com/office/drawing/2016/5/14/chartex" xmlns:mc="http://schemas.openxmlformats.org/markup-compatibility/2006" xmlns:aink="http://schemas.microsoft.com/office/drawing/2016/ink" xmlns:am3d="http://schemas.microsoft.com/office/drawing/2017/model3d" xmlns:o="urn:schemas-microsoft-com:office:office" xmlns:oel="http://schemas.microsoft.com/office/2019/extlst" xmlns:r="http://schemas.openxmlformats.org/officeDocument/2006/relationships" xmlns:m="http://schemas.openxmlformats.org/officeDocument/2006/math" xmlns:v="urn:schemas-microsoft-com:vml" xmlns:wp14="http://schemas.microsoft.com/office/word/2010/wordprocessingDrawing" xmlns:wp="http://schemas.openxmlformats.org/drawingml/2006/wordprocessingDrawing" xmlns:w10="urn:schemas-microsoft-com:office:word" xmlns:w="http://schemas.openxmlformats.org/wordprocessingml/2006/main" xmlns:w14="http://schemas.microsoft.com/office/word/2010/wordml" xmlns:w15="http://schemas.microsoft.com/office/word/2012/wordml" xmlns:w16cex="http://schemas.microsoft.com/office/word/2018/wordml/cex" xmlns:w16cid="http://schemas.microsoft.com/office/word/2016/wordml/cid" xmlns:w16="http://schemas.microsoft.com/office/word/2018/wordml" xmlns:w16du="http://schemas.microsoft.com/office/word/2023/wordml/word16du" xmlns:w16sdtdh="http://schemas.microsoft.com/office/word/2020/wordml/sdtdatahash" xmlns:w16sdtfl="http://schemas.microsoft.com/office/word/2024/wordml/sdtformatlock" xmlns:w16se="http://schemas.microsoft.com/office/word/2015/wordml/symex" xmlns:wpg="http://schemas.microsoft.com/office/word/2010/wordprocessingGroup" xmlns:wpi="http://schemas.microsoft.com/office/word/2010/wordprocessingInk" xmlns:wne="http://schemas.microsoft.com/office/word/2006/wordml" xmlns:wps="http://schemas.microsoft.com/office/word/2010/wordprocessingShape" mc:Ignorable="w14 w15 w16se w16cid w16 w16cex w16sdtdh w16sdtfl w16du wp14">
+  <w:footnote w:type="separator" w:id="-1">
+    <w:p>
+      <w:pPr>
+        <w:spacing w:after="0" w:line="240" w:lineRule="auto"/>
+      </w:pPr>
+      <w:r>
+        <w:separator/>
+      </w:r>
+    </w:p>
+  </w:footnote>
+  <w:footnote w:type="continuationSeparator" w:id="0">
+    <w:p>
+      <w:pPr>
+        <w:spacing w:after="0" w:line="240" w:lineRule="auto"/>
+      </w:pPr>
+      <w:r>
+        <w:continuationSeparator/>
+      </w:r>
+    </w:p>
+  </w:footnote>
+</w:footnotes>
 </file>
 
 <file path=word/styles.xml><?xml version="1.0" encoding="utf-8"?>
@@ -704,6 +2341,7 @@
   <w:style w:type="paragraph" w:default="1" w:styleId="Normal">
     <w:name w:val="Normal"/>
     <w:qFormat/>
+    <w:rsid w:val="00880728"/>
   </w:style>
   <w:style w:type="paragraph" w:styleId="Heading1">
     <w:name w:val="heading 1"/>
@@ -907,7 +2545,6 @@
   <w:style w:type="character" w:default="1" w:styleId="DefaultParagraphFont">
     <w:name w:val="Default Paragraph Font"/>
     <w:uiPriority w:val="1"/>
-    <w:semiHidden/>
     <w:unhideWhenUsed/>
   </w:style>
   <w:style w:type="table" w:default="1" w:styleId="TableNormal">
@@ -1220,6 +2857,80 @@
       <w:color w:val="2F5496" w:themeColor="accent1" w:themeShade="BF"/>
       <w:spacing w:val="5"/>
     </w:rPr>
+  </w:style>
+  <w:style w:type="table" w:styleId="TableGrid">
+    <w:name w:val="Table Grid"/>
+    <w:basedOn w:val="TableNormal"/>
+    <w:uiPriority w:val="39"/>
+    <w:rsid w:val="002C66E0"/>
+    <w:pPr>
+      <w:spacing w:after="0" w:line="240" w:lineRule="auto"/>
+    </w:pPr>
+    <w:tblPr>
+      <w:tblBorders>
+        <w:top w:val="single" w:sz="4" w:space="0" w:color="auto"/>
+        <w:left w:val="single" w:sz="4" w:space="0" w:color="auto"/>
+        <w:bottom w:val="single" w:sz="4" w:space="0" w:color="auto"/>
+        <w:right w:val="single" w:sz="4" w:space="0" w:color="auto"/>
+        <w:insideH w:val="single" w:sz="4" w:space="0" w:color="auto"/>
+        <w:insideV w:val="single" w:sz="4" w:space="0" w:color="auto"/>
+      </w:tblBorders>
+    </w:tblPr>
+  </w:style>
+  <w:style w:type="character" w:styleId="Strong">
+    <w:name w:val="Strong"/>
+    <w:basedOn w:val="DefaultParagraphFont"/>
+    <w:uiPriority w:val="22"/>
+    <w:qFormat/>
+    <w:rsid w:val="00B87A00"/>
+    <w:rPr>
+      <w:b/>
+      <w:bCs/>
+    </w:rPr>
+  </w:style>
+  <w:style w:type="paragraph" w:styleId="Header">
+    <w:name w:val="header"/>
+    <w:basedOn w:val="Normal"/>
+    <w:link w:val="HeaderChar"/>
+    <w:uiPriority w:val="99"/>
+    <w:unhideWhenUsed/>
+    <w:rsid w:val="00FD7735"/>
+    <w:pPr>
+      <w:tabs>
+        <w:tab w:val="center" w:pos="4513"/>
+        <w:tab w:val="right" w:pos="9026"/>
+      </w:tabs>
+      <w:spacing w:after="0" w:line="240" w:lineRule="auto"/>
+    </w:pPr>
+  </w:style>
+  <w:style w:type="character" w:customStyle="1" w:styleId="HeaderChar">
+    <w:name w:val="Header Char"/>
+    <w:basedOn w:val="DefaultParagraphFont"/>
+    <w:link w:val="Header"/>
+    <w:uiPriority w:val="99"/>
+    <w:rsid w:val="00FD7735"/>
+  </w:style>
+  <w:style w:type="paragraph" w:styleId="Footer">
+    <w:name w:val="footer"/>
+    <w:basedOn w:val="Normal"/>
+    <w:link w:val="FooterChar"/>
+    <w:uiPriority w:val="99"/>
+    <w:unhideWhenUsed/>
+    <w:rsid w:val="00FD7735"/>
+    <w:pPr>
+      <w:tabs>
+        <w:tab w:val="center" w:pos="4513"/>
+        <w:tab w:val="right" w:pos="9026"/>
+      </w:tabs>
+      <w:spacing w:after="0" w:line="240" w:lineRule="auto"/>
+    </w:pPr>
+  </w:style>
+  <w:style w:type="character" w:customStyle="1" w:styleId="FooterChar">
+    <w:name w:val="Footer Char"/>
+    <w:basedOn w:val="DefaultParagraphFont"/>
+    <w:link w:val="Footer"/>
+    <w:uiPriority w:val="99"/>
+    <w:rsid w:val="00FD7735"/>
   </w:style>
 </w:styles>
 </file>

</xml_diff>